<commit_message>
Add resident IVF indexes and exact-quota landmarks
</commit_message>
<xml_diff>
--- a/manuscript/kodama_cpp_jmlr_cover_letter.docx
+++ b/manuscript/kodama_cpp_jmlr_cover_letter.docx
@@ -79,10 +79,38 @@
         <w:rPr>
           <w:b/>
         </w:rPr>
+        <w:t xml:space="preserve">R wrapper URL: </w:t>
+      </w:r>
+      <w:r>
+        <w:t>https://github.com/tkcaccia/kodama-r</w:t>
+      </w:r>
+    </w:p>
+    <w:p>
+      <w:pPr>
+        <w:spacing w:after="40"/>
+      </w:pPr>
+      <w:r>
+        <w:rPr>
+          <w:b/>
+        </w:rPr>
+        <w:t xml:space="preserve">Python binding source: </w:t>
+      </w:r>
+      <w:r>
+        <w:t>https://github.com/tkcaccia/kodama-cpp/tree/main/split-repos/kodama-python (standalone repository publication pending)</w:t>
+      </w:r>
+    </w:p>
+    <w:p>
+      <w:pPr>
+        <w:spacing w:after="40"/>
+      </w:pPr>
+      <w:r>
+        <w:rPr>
+          <w:b/>
+        </w:rPr>
         <w:t xml:space="preserve">Software version: </w:t>
       </w:r>
       <w:r>
-        <w:t>0.1.0</w:t>
+        <w:t>0.1.0 release candidate</w:t>
       </w:r>
     </w:p>
     <w:p>
@@ -96,7 +124,21 @@
         <w:t xml:space="preserve">Reviewed baseline: </w:t>
       </w:r>
       <w:r>
-        <w:t>0e019c1c2d371e330355afa9ca7fa3b18761de0a</w:t>
+        <w:t>9da48ee03d4ce76d50adf7cae0189b8ea7d65c62</w:t>
+      </w:r>
+    </w:p>
+    <w:p>
+      <w:pPr>
+        <w:spacing w:after="40"/>
+      </w:pPr>
+      <w:r>
+        <w:rPr>
+          <w:b/>
+        </w:rPr>
+        <w:t xml:space="preserve">Reviewed R-wrapper baseline: </w:t>
+      </w:r>
+      <w:r>
+        <w:t>4d5506bde8918162dae0ad1d19c4f6f7a4df64ba</w:t>
       </w:r>
     </w:p>
     <w:p>
@@ -121,10 +163,10 @@
         <w:rPr>
           <w:b/>
         </w:rPr>
-        <w:t xml:space="preserve">Archival DOI: </w:t>
+        <w:t xml:space="preserve">Archived source: </w:t>
       </w:r>
       <w:r>
-        <w:t>AUTHOR ACTION REQUIRED: insert after depositing the tagged source archive</w:t>
+        <w:t>AUTHOR ACTION REQUIRED: deposit the tagged source archive, insert its URL and checksum, and add a DOI if assigned</w:t>
       </w:r>
     </w:p>
     <w:p>
@@ -163,7 +205,7 @@
     </w:p>
     <w:p>
       <w:r>
-        <w:t>KODAMA has an established public predecessor: a peer-reviewed method paper, a peer-reviewed R-package paper, a maintained public R package, documentation, and public source history. kodama-cpp itself is a new repository, so the cover letter should not inflate its current star or contributor count. AUTHOR ACTION REQUIRED: add a dated CRAN/R-universe download count and current repository metrics immediately before submission. The repository provides an issue tracker, contribution guide, changelog, API-stability policy, reproducible tests, and release checklist.</w:t>
+        <w:t>KODAMA has an established public predecessor: a peer-reviewed method paper, a peer-reviewed R-package paper, a maintained public R package, documentation, and public source history. The CRANlogs public API reports 48,480 KODAMA downloads from 2017-01-01 through 2026-07-26, including 4,526 during 2025-07-27--2026-07-26 (https://cranlogs.r-pkg.org/downloads/total/2017-01-01:2026-07-26/KODAMA and https://cranlogs.r-pkg.org/downloads/total/2025-07-27:2026-07-26/KODAMA). These counts concern the predecessor R package, not the new implementation. kodama-cpp itself is a new repository and, on 2026-07-27, had zero GitHub stars, forks, releases, and public issues; these figures are disclosed rather than presented as adoption. AUTHOR ACTION REQUIRED: refresh the dated counts and add any independently verifiable user or downstream-package evidence available immediately before submission. The repository provides an issue tracker, contribution guide, changelog, API-stability policy, reproducible tests, and release checklist.</w:t>
       </w:r>
     </w:p>
     <w:p>

</xml_diff>

<commit_message>
Add reusable graph API and backend validation
</commit_message>
<xml_diff>
--- a/manuscript/kodama_cpp_jmlr_cover_letter.docx
+++ b/manuscript/kodama_cpp_jmlr_cover_letter.docx
@@ -124,7 +124,7 @@
         <w:t xml:space="preserve">Reviewed baseline: </w:t>
       </w:r>
       <w:r>
-        <w:t>9da48ee03d4ce76d50adf7cae0189b8ea7d65c62</w:t>
+        <w:t>a32f71844fb0860f8faec0169c2850f800a68da4</w:t>
       </w:r>
     </w:p>
     <w:p>
@@ -179,7 +179,7 @@
     </w:p>
     <w:p>
       <w:r>
-        <w:t>The submission preserves KODAMA's cross-validated label-predictability objective while moving its repeated work into one typed float32 core. It contributes package-owned nearest-neighbor, SIMPLS/LDA, graph, and visualization paths; strict and observable CPU/CUDA/Metal execution; matrix and supplied-graph entry points; and a common API for R and Python. The repository contains installation instructions, API examples, tests, benchmark drivers, a public API snapshot, and a machine-checkable licensing/provenance audit.</w:t>
+        <w:t>The submission preserves KODAMA's cross-validated label-predictability signal while making four contributions: a standalone C++17 core for thin R/Python wrappers; native and observable CPU/CUDA/Metal execution; guided label evolution based on out-of-fold predictions and class transitions; and an exact-quota landmark-projection strategy that generalizes the landmark idea introduced in the KODAMA bioRxiv work. The repository contains installation instructions, API examples, explicit pseudocode, tests, benchmark drivers, a public API snapshot, and a machine-checkable licensing/provenance audit.</w:t>
       </w:r>
     </w:p>
     <w:p>
@@ -192,7 +192,7 @@
     </w:p>
     <w:p>
       <w:r>
-        <w:t>The KODAMA method was published by Cacciatore, Luchinat, and Tenori in PNAS (2014), and the historical R package was described by Cacciatore et al. in Bioinformatics (2017). Prior publication of the method is disclosed. This submission concerns the new standalone software: a C++17 core independent of R, native CUDA and Metal backends, float32 and label-aware SIMPLS/LDA, package-owned neighbor search, graph-input APIs, strict backend metadata, and separately maintained R/Python bindings. The detailed delta is recorded in docs/previous-version-delta.md. The two prior papers will be supplied as supplementary material.</w:t>
+        <w:t>The KODAMA method was published by Cacciatore, Luchinat, and Tenori in PNAS (2014), and the historical R package was described by Cacciatore et al. in Bioinformatics (2017). Prior publication of the method is disclosed. The landmark-projection principle was subsequently introduced in the 2025 KODAMA bioRxiv preprint. This submission concerns its general formalization and the new standalone software: a C++17 core independent of R, native CUDA and Metal backends, guided search mechanics, exact-quota landmark selection, float32 label-aware SIMPLS/LDA, package-owned neighbor search, strict backend metadata, and separately maintained R/Python bindings. The detailed delta is recorded in docs/previous-version-delta.md. The prior papers and preprint will be supplied as supplementary material.</w:t>
       </w:r>
     </w:p>
     <w:p>
@@ -296,11 +296,11 @@
     </w:p>
     <w:p>
       <w:r>
-        <w:t>Stefano Cacciatore</w:t>
+        <w:t>Leonardo Tenori and Stefano Cacciatore</w:t>
         <w:br/>
-        <w:t>Corresponding author</w:t>
+        <w:t>Co-corresponding authors</w:t>
         <w:br/>
-        <w:t>stefano.cacciatore@icgeb.org</w:t>
+        <w:t>tenori@cerm.unifi.it; stefano.cacciatore@icgeb.org</w:t>
       </w:r>
     </w:p>
     <w:sectPr>

</xml_diff>

<commit_message>
Optimize resident backends and add fresh validation
</commit_message>
<xml_diff>
--- a/manuscript/kodama_cpp_jmlr_cover_letter.docx
+++ b/manuscript/kodama_cpp_jmlr_cover_letter.docx
@@ -96,7 +96,7 @@
         <w:t xml:space="preserve">Python binding source: </w:t>
       </w:r>
       <w:r>
-        <w:t>https://github.com/tkcaccia/kodama-cpp/tree/main/split-repos/kodama-python (standalone repository publication pending)</w:t>
+        <w:t>https://github.com/tkcaccia/kodama-cpp/tree/main/split-repos/kodama-python (versioned and tested with the core source)</w:t>
       </w:r>
     </w:p>
     <w:p>
@@ -179,7 +179,7 @@
     </w:p>
     <w:p>
       <w:r>
-        <w:t>The submission preserves KODAMA's cross-validated label-predictability signal while making four contributions: a standalone C++17 core for thin R/Python wrappers; native and observable CPU/CUDA/Metal execution; guided label evolution based on out-of-fold predictions and class transitions; and an exact-quota landmark-projection strategy that generalizes the landmark idea introduced in the KODAMA bioRxiv work. The repository contains installation instructions, API examples, explicit pseudocode, tests, benchmark drivers, a public API snapshot, and a machine-checkable licensing/provenance audit.</w:t>
+        <w:t>The submission preserves KODAMA's cross-validated label-predictability signal while making five contributions: a standalone C++17 core for thin R/Python wrappers; native and observable CPU/CUDA/Metal execution; label-aware SIMPLS followed by latent-space LDA as a new KODAMA evaluator; guided label evolution based on out-of-fold predictions and class transitions; and an exact-quota landmark-projection strategy for scalable, reproducible subsampling. The repository contains installation instructions, API examples, explicit pseudocode, tests, benchmark drivers, a public API snapshot, and a machine-checkable licensing/provenance audit.</w:t>
       </w:r>
     </w:p>
     <w:p>
@@ -192,7 +192,7 @@
     </w:p>
     <w:p>
       <w:r>
-        <w:t>The KODAMA method was published by Cacciatore, Luchinat, and Tenori in PNAS (2014), and the historical R package was described by Cacciatore et al. in Bioinformatics (2017). Prior publication of the method is disclosed. The landmark-projection principle was subsequently introduced in the 2025 KODAMA bioRxiv preprint. This submission concerns its general formalization and the new standalone software: a C++17 core independent of R, native CUDA and Metal backends, guided search mechanics, exact-quota landmark selection, float32 label-aware SIMPLS/LDA, package-owned neighbor search, strict backend metadata, and separately maintained R/Python bindings. The detailed delta is recorded in docs/previous-version-delta.md. The prior papers and preprint will be supplied as supplementary material.</w:t>
+        <w:t>The KODAMA method was published by Cacciatore, Luchinat, and Tenori in PNAS (2014), and the historical R package was described by Cacciatore et al. in Bioinformatics (2017). Prior publication of the method is disclosed. This submission concerns the new standalone software: a C++17 core independent of R, native CUDA and Metal backends, guided search mechanics, exact-quota landmark selection, float32 label-aware SIMPLS/LDA, package-owned neighbor search, strict backend metadata, and thin R/Python bindings. KODAMA R 2.4.1/2.4 is the sole previous-version comparator; later KODAMA releases are excluded from performance, quality, and methodological comparisons. The matched KNN comparison is complemented by a contextual MetRef PLS-DA benchmark. It is reported without a matched-speedup claim because the new implementation introduces label-aware SIMPLS followed by latent-space LDA. The detailed delta is recorded in docs/previous-version-delta.md. The prior peer-reviewed papers will be supplied as supplementary material.</w:t>
       </w:r>
     </w:p>
     <w:p>

</xml_diff>